<commit_message>
Manual: fresh Workflow-tab screenshot for Figure 2.7
The old picture still read "Waiting for a Supervisor to assign a
technician". Recaptured from the test site as a Requester; Requester and
Complete guides, Word and PDF.

Co-Authored-By: Claude Opus 5.5 <noreply@anthropic.com>
</commit_message>
<xml_diff>
--- a/docs/user-manual/SI_Requester_Guide.docx
+++ b/docs/user-manual/SI_Requester_Guide.docx
@@ -7887,7 +7887,7 @@
         </w:rPr>
         <w:drawing>
           <wp:inline distT="0" distB="0" distL="0" distR="0" wp14:anchorId="4329196F" wp14:editId="1AC19B95">
-            <wp:extent cx="6096000" cy="2257425"/>
+            <wp:extent cx="6096000" cy="1975945"/>
             <wp:effectExtent l="19050" t="19050" r="19050" b="19050"/>
             <wp:docPr id="100427166" name="Picture 100427166"/>
             <wp:cNvGraphicFramePr>
@@ -7912,7 +7912,7 @@
                   <pic:spPr bwMode="auto">
                     <a:xfrm>
                       <a:off x="0" y="0"/>
-                      <a:ext cx="6096000" cy="2257425"/>
+                      <a:ext cx="6096000" cy="1975945"/>
                     </a:xfrm>
                     <a:prstGeom prst="rect">
                       <a:avLst/>

</xml_diff>